<commit_message>
Adicionado variáveis nos documentos
</commit_message>
<xml_diff>
--- a/Cadastro_Sementes_do_Amanha/docs/termo_de_autorizacao_saida_desacompanhada.docx
+++ b/Cadastro_Sementes_do_Amanha/docs/termo_de_autorizacao_saida_desacompanhada.docx
@@ -69,21 +69,21 @@
               <wp:posOffset>70684</wp:posOffset>
             </wp:positionH>
             <wp:positionV relativeFrom="paragraph">
-              <wp:posOffset>-310472</wp:posOffset>
+              <wp:posOffset>-310470</wp:posOffset>
             </wp:positionV>
             <wp:extent cx="753321" cy="874019"/>
             <wp:effectExtent b="0" l="0" r="0" t="0"/>
             <wp:wrapNone/>
-            <wp:docPr id="2" name="image2.png"/>
+            <wp:docPr id="2" name="image1.png"/>
             <a:graphic>
               <a:graphicData uri="http://schemas.openxmlformats.org/drawingml/2006/picture">
                 <pic:pic>
                   <pic:nvPicPr>
-                    <pic:cNvPr id="0" name="image2.png"/>
+                    <pic:cNvPr id="0" name="image1.png"/>
                     <pic:cNvPicPr preferRelativeResize="0"/>
                   </pic:nvPicPr>
                   <pic:blipFill>
-                    <a:blip r:embed="rId6"/>
+                    <a:blip r:embed="rId7"/>
                     <a:srcRect b="0" l="0" r="0" t="0"/>
                     <a:stretch>
                       <a:fillRect/>
@@ -320,118 +320,15 @@
           <w:szCs w:val="24"/>
           <w:rtl w:val="0"/>
         </w:rPr>
-        <w:t xml:space="preserve">Eu</w:t>
+        <w:t xml:space="preserve">Eu </w:t>
       </w:r>
       <w:r>
         <w:rPr>
           <w:sz w:val="24"/>
           <w:szCs w:val="24"/>
-          <w:u w:val="single"/>
-          <w:rtl w:val="0"/>
-        </w:rPr>
-        <w:tab/>
-      </w:r>
-      <w:r>
-        <w:rPr>
-          <w:sz w:val="24"/>
-          <w:szCs w:val="24"/>
-          <w:rtl w:val="0"/>
-        </w:rPr>
-        <w:t xml:space="preserve"> portador</w:t>
-        <w:tab/>
-        <w:t xml:space="preserve">do</w:t>
-        <w:tab/>
-        <w:t xml:space="preserve">RG.</w:t>
-      </w:r>
-    </w:p>
-    <w:p>
-      <w:pPr>
-        <w:tabs>
-          <w:tab w:val="left" w:leader="none" w:pos="5219"/>
-          <w:tab w:val="left" w:leader="none" w:pos="6852"/>
-          <w:tab w:val="left" w:leader="none" w:pos="7775"/>
-          <w:tab w:val="left" w:leader="none" w:pos="8929"/>
-        </w:tabs>
-        <w:spacing w:before="146" w:lineRule="auto"/>
-        <w:ind w:left="437" w:right="0" w:firstLine="0"/>
-        <w:jc w:val="left"/>
-        <w:rPr>
-          <w:sz w:val="24"/>
-          <w:szCs w:val="24"/>
-        </w:rPr>
-      </w:pPr>
-      <w:r>
-        <w:rPr>
-          <w:sz w:val="24"/>
-          <w:szCs w:val="24"/>
-          <w:u w:val="single"/>
-          <w:rtl w:val="0"/>
-        </w:rPr>
-        <w:tab/>
-      </w:r>
-      <w:r>
-        <w:rPr>
-          <w:sz w:val="24"/>
-          <w:szCs w:val="24"/>
-          <w:rtl w:val="0"/>
-        </w:rPr>
-        <w:t xml:space="preserve">responsável</w:t>
-        <w:tab/>
-        <w:t xml:space="preserve">legal</w:t>
-        <w:tab/>
-        <w:t xml:space="preserve">pelo(a)</w:t>
-        <w:tab/>
-        <w:t xml:space="preserve">criança/adolescente</w:t>
-      </w:r>
-    </w:p>
-    <w:p>
-      <w:pPr>
-        <w:tabs>
-          <w:tab w:val="left" w:leader="none" w:pos="6368"/>
-          <w:tab w:val="left" w:leader="none" w:pos="7489"/>
-        </w:tabs>
-        <w:spacing w:before="147" w:line="360" w:lineRule="auto"/>
-        <w:ind w:left="437" w:right="292" w:firstLine="0"/>
-        <w:jc w:val="left"/>
-        <w:rPr>
-          <w:sz w:val="24"/>
-          <w:szCs w:val="24"/>
-        </w:rPr>
-      </w:pPr>
-      <w:r>
-        <w:rPr>
-          <w:sz w:val="24"/>
-          <w:szCs w:val="24"/>
-          <w:u w:val="single"/>
-          <w:rtl w:val="0"/>
-        </w:rPr>
-        <w:tab/>
-        <w:tab/>
-      </w:r>
-      <w:r>
-        <w:rPr>
-          <w:sz w:val="24"/>
-          <w:szCs w:val="24"/>
-          <w:rtl w:val="0"/>
-        </w:rPr>
-        <w:t xml:space="preserve">matriculado nesta instituição para frequência nas atividades no período </w:t>
-      </w:r>
-      <w:r>
-        <w:rPr>
-          <w:sz w:val="24"/>
-          <w:szCs w:val="24"/>
-          <w:u w:val="single"/>
-          <w:rtl w:val="0"/>
-        </w:rPr>
-        <w:tab/>
-      </w:r>
-      <w:r>
-        <w:rPr>
-          <w:sz w:val="24"/>
-          <w:szCs w:val="24"/>
-          <w:rtl w:val="0"/>
-        </w:rPr>
-        <w:t xml:space="preserve">.</w:t>
+          <w:rtl w:val="0"/>
+        </w:rPr>
+        <w:t xml:space="preserve">{nome_responsavel} portador do RG: {rg_responsavel} ,responsável legal pelo(a) criança/adolescente matriculado nesta instituição {nome_crianca},  para frequência nas atividades no período da {periodo_atividades}.</w:t>
       </w:r>
     </w:p>
     <w:p>
@@ -508,7 +405,21 @@
           <w:szCs w:val="22"/>
           <w:rtl w:val="0"/>
         </w:rPr>
-        <w:t xml:space="preserve">(  ) AUTORIZO antecipadamente, a saída desacompanhada do menor após o encerramentos das atividades, o período especificado, de segunda a sexta-feira, bem como em eventos que possam ocorrer ocasionalmente aos finais de semana.</w:t>
+        <w:t xml:space="preserve">(  ) AUTORIZO antecipadamente, a saída desacompanhada do menor após o </w:t>
+      </w:r>
+      <w:r>
+        <w:rPr>
+          <w:rtl w:val="0"/>
+        </w:rPr>
+        <w:t xml:space="preserve">encerramento</w:t>
+      </w:r>
+      <w:r>
+        <w:rPr>
+          <w:sz w:val="22"/>
+          <w:szCs w:val="22"/>
+          <w:rtl w:val="0"/>
+        </w:rPr>
+        <w:t xml:space="preserve"> das atividades, o período especificado, de segunda a sexta-feira, bem como em eventos que possam ocorrer ocasionalmente aos finais de semana.</w:t>
       </w:r>
     </w:p>
     <w:p>
@@ -672,7 +583,36 @@
           <w:vertAlign w:val="baseline"/>
           <w:rtl w:val="0"/>
         </w:rPr>
-        <w:t xml:space="preserve">•Responsáveis autorizados a retirar o(a) criança/adolescente: O Pai e Mãe legalmente sempre são autorizados, exceto por Decisão Judicial. Neste caso, a Equipe Técnica deverá ter uma cópia da definição judicial.</w:t>
+        <w:t xml:space="preserve">•Responsáveis autorizados a retirar o(a) criança/adolescente: O Pai </w:t>
+      </w:r>
+      <w:r>
+        <w:rPr>
+          <w:i w:val="1"/>
+          <w:iCs w:val="1"/>
+          <w:sz w:val="16"/>
+          <w:szCs w:val="16"/>
+          <w:rtl w:val="0"/>
+        </w:rPr>
+        <w:t xml:space="preserve">e a Mãe</w:t>
+      </w:r>
+      <w:r>
+        <w:rPr>
+          <w:rFonts w:ascii="Calibri" w:cs="Calibri" w:eastAsia="Calibri" w:hAnsi="Calibri"/>
+          <w:b w:val="0"/>
+          <w:bCs w:val="0"/>
+          <w:i w:val="1"/>
+          <w:iCs w:val="1"/>
+          <w:smallCaps w:val="0"/>
+          <w:strike w:val="0"/>
+          <w:color w:val="000000"/>
+          <w:sz w:val="16"/>
+          <w:szCs w:val="16"/>
+          <w:u w:val="none"/>
+          <w:shd w:fill="auto" w:val="clear"/>
+          <w:vertAlign w:val="baseline"/>
+          <w:rtl w:val="0"/>
+        </w:rPr>
+        <w:t xml:space="preserve"> legalmente sempre são autorizados, exceto por Decisão Judicial. Neste caso, a Equipe Técnica deverá ter uma cópia da definição judicial.</w:t>
       </w:r>
     </w:p>
     <w:p>
@@ -1089,7 +1029,6 @@
             <w:pPr>
               <w:keepNext w:val="0"/>
               <w:keepLines w:val="0"/>
-              <w:pageBreakBefore w:val="0"/>
               <w:widowControl w:val="0"/>
               <w:pBdr>
                 <w:top w:space="0" w:sz="0" w:val="nil"/>
@@ -1145,7 +1084,6 @@
             <w:pPr>
               <w:keepNext w:val="0"/>
               <w:keepLines w:val="0"/>
-              <w:pageBreakBefore w:val="0"/>
               <w:widowControl w:val="0"/>
               <w:pBdr>
                 <w:top w:space="0" w:sz="0" w:val="nil"/>
@@ -1201,7 +1139,6 @@
             <w:pPr>
               <w:keepNext w:val="0"/>
               <w:keepLines w:val="0"/>
-              <w:pageBreakBefore w:val="0"/>
               <w:widowControl w:val="0"/>
               <w:pBdr>
                 <w:top w:space="0" w:sz="0" w:val="nil"/>
@@ -1264,7 +1201,6 @@
             <w:pPr>
               <w:keepNext w:val="0"/>
               <w:keepLines w:val="0"/>
-              <w:pageBreakBefore w:val="0"/>
               <w:widowControl w:val="0"/>
               <w:pBdr>
                 <w:top w:space="0" w:sz="0" w:val="nil"/>
@@ -1320,7 +1256,6 @@
             <w:pPr>
               <w:keepNext w:val="0"/>
               <w:keepLines w:val="0"/>
-              <w:pageBreakBefore w:val="0"/>
               <w:widowControl w:val="0"/>
               <w:pBdr>
                 <w:top w:space="0" w:sz="0" w:val="nil"/>
@@ -1351,6 +1286,15 @@
             </w:pPr>
             <w:r>
               <w:rPr>
+                <w:rFonts w:ascii="Times New Roman" w:cs="Times New Roman" w:eastAsia="Times New Roman" w:hAnsi="Times New Roman"/>
+                <w:sz w:val="18"/>
+                <w:szCs w:val="18"/>
+                <w:rtl w:val="0"/>
+              </w:rPr>
+              <w:t xml:space="preserve">{resp_1_nome}</w:t>
+            </w:r>
+            <w:r>
+              <w:rPr>
                 <w:rtl w:val="0"/>
               </w:rPr>
             </w:r>
@@ -1362,7 +1306,6 @@
             <w:pPr>
               <w:keepNext w:val="0"/>
               <w:keepLines w:val="0"/>
-              <w:pageBreakBefore w:val="0"/>
               <w:widowControl w:val="0"/>
               <w:pBdr>
                 <w:top w:space="0" w:sz="0" w:val="nil"/>
@@ -1391,6 +1334,15 @@
                 <w:vertAlign w:val="baseline"/>
               </w:rPr>
             </w:pPr>
+            <w:r>
+              <w:rPr>
+                <w:rFonts w:ascii="Times New Roman" w:cs="Times New Roman" w:eastAsia="Times New Roman" w:hAnsi="Times New Roman"/>
+                <w:sz w:val="18"/>
+                <w:szCs w:val="18"/>
+                <w:rtl w:val="0"/>
+              </w:rPr>
+              <w:t xml:space="preserve">{resp_1_parentesco}</w:t>
+            </w:r>
             <w:r>
               <w:rPr>
                 <w:rtl w:val="0"/>
@@ -1411,7 +1363,6 @@
             <w:pPr>
               <w:keepNext w:val="0"/>
               <w:keepLines w:val="0"/>
-              <w:pageBreakBefore w:val="0"/>
               <w:widowControl w:val="0"/>
               <w:pBdr>
                 <w:top w:space="0" w:sz="0" w:val="nil"/>
@@ -1467,7 +1418,6 @@
             <w:pPr>
               <w:keepNext w:val="0"/>
               <w:keepLines w:val="0"/>
-              <w:pageBreakBefore w:val="0"/>
               <w:widowControl w:val="0"/>
               <w:pBdr>
                 <w:top w:space="0" w:sz="0" w:val="nil"/>
@@ -1498,6 +1448,15 @@
             </w:pPr>
             <w:r>
               <w:rPr>
+                <w:rFonts w:ascii="Times New Roman" w:cs="Times New Roman" w:eastAsia="Times New Roman" w:hAnsi="Times New Roman"/>
+                <w:sz w:val="18"/>
+                <w:szCs w:val="18"/>
+                <w:rtl w:val="0"/>
+              </w:rPr>
+              <w:t xml:space="preserve">{resp_2_nome}</w:t>
+            </w:r>
+            <w:r>
+              <w:rPr>
                 <w:rtl w:val="0"/>
               </w:rPr>
             </w:r>
@@ -1509,7 +1468,6 @@
             <w:pPr>
               <w:keepNext w:val="0"/>
               <w:keepLines w:val="0"/>
-              <w:pageBreakBefore w:val="0"/>
               <w:widowControl w:val="0"/>
               <w:pBdr>
                 <w:top w:space="0" w:sz="0" w:val="nil"/>
@@ -1538,6 +1496,15 @@
                 <w:vertAlign w:val="baseline"/>
               </w:rPr>
             </w:pPr>
+            <w:r>
+              <w:rPr>
+                <w:rFonts w:ascii="Times New Roman" w:cs="Times New Roman" w:eastAsia="Times New Roman" w:hAnsi="Times New Roman"/>
+                <w:sz w:val="18"/>
+                <w:szCs w:val="18"/>
+                <w:rtl w:val="0"/>
+              </w:rPr>
+              <w:t xml:space="preserve">{resp_2_parentesco}</w:t>
+            </w:r>
             <w:r>
               <w:rPr>
                 <w:rtl w:val="0"/>
@@ -1558,7 +1525,6 @@
             <w:pPr>
               <w:keepNext w:val="0"/>
               <w:keepLines w:val="0"/>
-              <w:pageBreakBefore w:val="0"/>
               <w:widowControl w:val="0"/>
               <w:pBdr>
                 <w:top w:space="0" w:sz="0" w:val="nil"/>
@@ -1614,7 +1580,6 @@
             <w:pPr>
               <w:keepNext w:val="0"/>
               <w:keepLines w:val="0"/>
-              <w:pageBreakBefore w:val="0"/>
               <w:widowControl w:val="0"/>
               <w:pBdr>
                 <w:top w:space="0" w:sz="0" w:val="nil"/>
@@ -1645,6 +1610,15 @@
             </w:pPr>
             <w:r>
               <w:rPr>
+                <w:rFonts w:ascii="Times New Roman" w:cs="Times New Roman" w:eastAsia="Times New Roman" w:hAnsi="Times New Roman"/>
+                <w:sz w:val="18"/>
+                <w:szCs w:val="18"/>
+                <w:rtl w:val="0"/>
+              </w:rPr>
+              <w:t xml:space="preserve">{resp_3_nome}</w:t>
+            </w:r>
+            <w:r>
+              <w:rPr>
                 <w:rtl w:val="0"/>
               </w:rPr>
             </w:r>
@@ -1656,7 +1630,6 @@
             <w:pPr>
               <w:keepNext w:val="0"/>
               <w:keepLines w:val="0"/>
-              <w:pageBreakBefore w:val="0"/>
               <w:widowControl w:val="0"/>
               <w:pBdr>
                 <w:top w:space="0" w:sz="0" w:val="nil"/>
@@ -1685,6 +1658,15 @@
                 <w:vertAlign w:val="baseline"/>
               </w:rPr>
             </w:pPr>
+            <w:r>
+              <w:rPr>
+                <w:rFonts w:ascii="Times New Roman" w:cs="Times New Roman" w:eastAsia="Times New Roman" w:hAnsi="Times New Roman"/>
+                <w:sz w:val="18"/>
+                <w:szCs w:val="18"/>
+                <w:rtl w:val="0"/>
+              </w:rPr>
+              <w:t xml:space="preserve">{resp_3_parentesco}</w:t>
+            </w:r>
             <w:r>
               <w:rPr>
                 <w:rtl w:val="0"/>
@@ -1705,7 +1687,6 @@
             <w:pPr>
               <w:keepNext w:val="0"/>
               <w:keepLines w:val="0"/>
-              <w:pageBreakBefore w:val="0"/>
               <w:widowControl w:val="0"/>
               <w:pBdr>
                 <w:top w:space="0" w:sz="0" w:val="nil"/>
@@ -1761,7 +1742,6 @@
             <w:pPr>
               <w:keepNext w:val="0"/>
               <w:keepLines w:val="0"/>
-              <w:pageBreakBefore w:val="0"/>
               <w:widowControl w:val="0"/>
               <w:pBdr>
                 <w:top w:space="0" w:sz="0" w:val="nil"/>
@@ -1792,6 +1772,15 @@
             </w:pPr>
             <w:r>
               <w:rPr>
+                <w:rFonts w:ascii="Times New Roman" w:cs="Times New Roman" w:eastAsia="Times New Roman" w:hAnsi="Times New Roman"/>
+                <w:sz w:val="18"/>
+                <w:szCs w:val="18"/>
+                <w:rtl w:val="0"/>
+              </w:rPr>
+              <w:t xml:space="preserve">{resp_4_nome}</w:t>
+            </w:r>
+            <w:r>
+              <w:rPr>
                 <w:rtl w:val="0"/>
               </w:rPr>
             </w:r>
@@ -1803,7 +1792,6 @@
             <w:pPr>
               <w:keepNext w:val="0"/>
               <w:keepLines w:val="0"/>
-              <w:pageBreakBefore w:val="0"/>
               <w:widowControl w:val="0"/>
               <w:pBdr>
                 <w:top w:space="0" w:sz="0" w:val="nil"/>
@@ -1832,6 +1820,15 @@
                 <w:vertAlign w:val="baseline"/>
               </w:rPr>
             </w:pPr>
+            <w:r>
+              <w:rPr>
+                <w:rFonts w:ascii="Times New Roman" w:cs="Times New Roman" w:eastAsia="Times New Roman" w:hAnsi="Times New Roman"/>
+                <w:sz w:val="18"/>
+                <w:szCs w:val="18"/>
+                <w:rtl w:val="0"/>
+              </w:rPr>
+              <w:t xml:space="preserve">{resp_4_parentesco}</w:t>
+            </w:r>
             <w:r>
               <w:rPr>
                 <w:rtl w:val="0"/>
@@ -1852,7 +1849,6 @@
             <w:pPr>
               <w:keepNext w:val="0"/>
               <w:keepLines w:val="0"/>
-              <w:pageBreakBefore w:val="0"/>
               <w:widowControl w:val="0"/>
               <w:pBdr>
                 <w:top w:space="0" w:sz="0" w:val="nil"/>
@@ -1908,7 +1904,6 @@
             <w:pPr>
               <w:keepNext w:val="0"/>
               <w:keepLines w:val="0"/>
-              <w:pageBreakBefore w:val="0"/>
               <w:widowControl w:val="0"/>
               <w:pBdr>
                 <w:top w:space="0" w:sz="0" w:val="nil"/>
@@ -1939,6 +1934,15 @@
             </w:pPr>
             <w:r>
               <w:rPr>
+                <w:rFonts w:ascii="Times New Roman" w:cs="Times New Roman" w:eastAsia="Times New Roman" w:hAnsi="Times New Roman"/>
+                <w:sz w:val="18"/>
+                <w:szCs w:val="18"/>
+                <w:rtl w:val="0"/>
+              </w:rPr>
+              <w:t xml:space="preserve">{resp_5_nome}</w:t>
+            </w:r>
+            <w:r>
+              <w:rPr>
                 <w:rtl w:val="0"/>
               </w:rPr>
             </w:r>
@@ -1950,7 +1954,6 @@
             <w:pPr>
               <w:keepNext w:val="0"/>
               <w:keepLines w:val="0"/>
-              <w:pageBreakBefore w:val="0"/>
               <w:widowControl w:val="0"/>
               <w:pBdr>
                 <w:top w:space="0" w:sz="0" w:val="nil"/>
@@ -1979,6 +1982,15 @@
                 <w:vertAlign w:val="baseline"/>
               </w:rPr>
             </w:pPr>
+            <w:r>
+              <w:rPr>
+                <w:rFonts w:ascii="Times New Roman" w:cs="Times New Roman" w:eastAsia="Times New Roman" w:hAnsi="Times New Roman"/>
+                <w:sz w:val="18"/>
+                <w:szCs w:val="18"/>
+                <w:rtl w:val="0"/>
+              </w:rPr>
+              <w:t xml:space="preserve">{resp_5_parentesco}</w:t>
+            </w:r>
             <w:r>
               <w:rPr>
                 <w:rtl w:val="0"/>
@@ -2099,57 +2111,9 @@
           <w:bCs w:val="1"/>
           <w:sz w:val="24"/>
           <w:szCs w:val="24"/>
-          <w:u w:val="single"/>
-          <w:rtl w:val="0"/>
-        </w:rPr>
-        <w:tab/>
-      </w:r>
-      <w:r>
-        <w:rPr>
-          <w:b w:val="1"/>
-          <w:bCs w:val="1"/>
-          <w:sz w:val="24"/>
-          <w:szCs w:val="24"/>
-          <w:rtl w:val="0"/>
-        </w:rPr>
-        <w:t xml:space="preserve">de</w:t>
-      </w:r>
-      <w:r>
-        <w:rPr>
-          <w:b w:val="1"/>
-          <w:bCs w:val="1"/>
-          <w:sz w:val="24"/>
-          <w:szCs w:val="24"/>
-          <w:u w:val="single"/>
-          <w:rtl w:val="0"/>
-        </w:rPr>
-        <w:tab/>
-      </w:r>
-      <w:r>
-        <w:rPr>
-          <w:b w:val="1"/>
-          <w:bCs w:val="1"/>
-          <w:sz w:val="24"/>
-          <w:szCs w:val="24"/>
-          <w:rtl w:val="0"/>
-        </w:rPr>
-        <w:t xml:space="preserve">de</w:t>
-      </w:r>
-      <w:r>
-        <w:rPr>
-          <w:b w:val="1"/>
-          <w:bCs w:val="1"/>
-          <w:sz w:val="24"/>
-          <w:szCs w:val="24"/>
-          <w:u w:val="single"/>
-          <w:rtl w:val="0"/>
-        </w:rPr>
-        <w:tab/>
-      </w:r>
-      <w:r>
-        <w:rPr>
-          <w:rtl w:val="0"/>
-        </w:rPr>
+          <w:rtl w:val="0"/>
+        </w:rPr>
+        <w:t xml:space="preserve">{dia} de {mes} de {ano}</w:t>
       </w:r>
     </w:p>
     <w:p>
@@ -2317,9 +2281,9 @@
                   <wp:posOffset>2556789</wp:posOffset>
                 </wp:positionH>
                 <wp:positionV relativeFrom="paragraph">
-                  <wp:posOffset>229884</wp:posOffset>
+                  <wp:posOffset>223534</wp:posOffset>
                 </wp:positionV>
-                <wp:extent cx="2087880" cy="1270"/>
+                <wp:extent cx="2087880" cy="12700"/>
                 <wp:effectExtent b="0" l="0" r="0" t="0"/>
                 <wp:wrapTopAndBottom distB="0" distT="0"/>
                 <wp:docPr id="1" name=""/>
@@ -2327,20 +2291,16 @@
                   <a:graphicData uri="http://schemas.microsoft.com/office/word/2010/wordprocessingShape">
                     <wps:wsp>
                       <wps:cNvSpPr/>
-                      <wps:cNvPr id="2" name="Graphic 2"/>
+                      <wps:cNvPr id="2" name="Shape 2"/>
                       <wps:spPr>
                         <a:xfrm>
-                          <a:off x="0" y="0"/>
+                          <a:off x="4302060" y="3779365"/>
                           <a:ext cx="2087880" cy="1270"/>
                         </a:xfrm>
                         <a:custGeom>
-                          <a:avLst/>
-                          <a:gdLst/>
-                          <a:ahLst/>
-                          <a:cxnLst/>
                           <a:rect b="b" l="l" r="r" t="t"/>
                           <a:pathLst>
-                            <a:path h="0" w="2087880">
+                            <a:path extrusionOk="0" h="120000" w="2087880">
                               <a:moveTo>
                                 <a:pt x="0" y="0"/>
                               </a:moveTo>
@@ -2350,17 +2310,18 @@
                             </a:path>
                           </a:pathLst>
                         </a:custGeom>
-                        <a:ln w="12712">
+                        <a:noFill/>
+                        <a:ln cap="flat" cmpd="sng" w="12700">
                           <a:solidFill>
                             <a:srgbClr val="000000"/>
                           </a:solidFill>
                           <a:prstDash val="solid"/>
+                          <a:round/>
+                          <a:headEnd len="sm" w="sm" type="none"/>
+                          <a:tailEnd len="sm" w="sm" type="none"/>
                         </a:ln>
                       </wps:spPr>
-                      <wps:bodyPr bIns="0" rtlCol="0" lIns="0" rIns="0" wrap="square" tIns="0">
-                        <a:prstTxWarp prst="textNoShape">
-                          <a:avLst/>
-                        </a:prstTxWarp>
+                      <wps:bodyPr anchorCtr="0" anchor="ctr" bIns="91425" lIns="91425" spcFirstLastPara="1" rIns="91425" wrap="square" tIns="91425">
                         <a:noAutofit/>
                       </wps:bodyPr>
                     </wps:wsp>
@@ -2377,22 +2338,22 @@
                   <wp:posOffset>2556789</wp:posOffset>
                 </wp:positionH>
                 <wp:positionV relativeFrom="paragraph">
-                  <wp:posOffset>229884</wp:posOffset>
+                  <wp:posOffset>223534</wp:posOffset>
                 </wp:positionV>
-                <wp:extent cx="2087880" cy="1270"/>
+                <wp:extent cx="2087880" cy="12700"/>
                 <wp:effectExtent b="0" l="0" r="0" t="0"/>
                 <wp:wrapTopAndBottom distB="0" distT="0"/>
-                <wp:docPr id="1" name="image1.png"/>
+                <wp:docPr id="1" name="image2.png"/>
                 <a:graphic>
                   <a:graphicData uri="http://schemas.openxmlformats.org/drawingml/2006/picture">
                     <pic:pic>
                       <pic:nvPicPr>
-                        <pic:cNvPr id="0" name="image1.png"/>
+                        <pic:cNvPr id="0" name="image2.png"/>
                         <pic:cNvPicPr preferRelativeResize="0"/>
                       </pic:nvPicPr>
                       <pic:blipFill>
-                        <a:blip r:embed="rId7"/>
-                        <a:srcRect b="0" l="0" r="0" t="0"/>
+                        <a:blip r:embed="rId8"/>
+                        <a:srcRect/>
                         <a:stretch>
                           <a:fillRect/>
                         </a:stretch>
@@ -2400,7 +2361,7 @@
                       <pic:spPr>
                         <a:xfrm>
                           <a:off x="0" y="0"/>
-                          <a:ext cx="2087880" cy="1270"/>
+                          <a:ext cx="2087880" cy="12700"/>
                         </a:xfrm>
                         <a:prstGeom prst="rect"/>
                         <a:ln/>
@@ -3011,4 +2972,19 @@
   </a:objectDefaults>
   <a:extraClrSchemeLst/>
 </a:theme>
+</file>
+
+<file path=customXML/item1.xml><?xml version="1.0" encoding="utf-8"?>
+<go:gDocsCustomXmlDataStorage xmlns:go="http://customooxmlschemas.google.com/" xmlns:r="http://schemas.openxmlformats.org/officeDocument/2006/relationships" uri="GoogleDocsCustomDataVersion2">
+  <go:docsCustomData xmlns:go="http://customooxmlschemas.google.com/" roundtripDataSignature="AMtx7miQOBU6en+/ABpIGSAHR74s/oWZZQ==">CgMxLjA4AHIhMVl2RmFodXZ0SUViNVI5RlFJN3RPM2NBS0UySnRZdFFt</go:docsCustomData>
+</go:gDocsCustomXmlDataStorage>
+</file>
+
+<file path=customXML/itemProps1.xml><?xml version="1.0" encoding="utf-8"?>
+<ds:datastoreItem xmlns:ds="http://schemas.openxmlformats.org/officeDocument/2006/customXml" ds:itemID="{11111111-1234-1234-1234-123412341234}">
+  <ds:schemaRefs>
+    <ds:schemaRef ds:uri="http://schemas.openxmlformats.org/officeDocument/2006/relationships"/>
+    <ds:schemaRef ds:uri="http://customooxmlschemas.google.com/"/>
+  </ds:schemaRefs>
+</ds:datastoreItem>
 </file>
</xml_diff>